<commit_message>
Update book introductions for 2026-09-18 release
</commit_message>
<xml_diff>
--- a/arb/docx/01.content.docx
+++ b/arb/docx/01.content.docx
@@ -9,6 +9,8 @@
       </w:pPr>
       <w:r>
         <w:rPr>
+          <w:rtl/>
+          <w:cs/>
           <w:lang w:val="ar_AE" w:bidi="ar_AE"/>
         </w:rPr>
       </w:r>
@@ -20,12 +22,16 @@
       </w:pPr>
       <w:r>
         <w:rPr>
+          <w:rtl/>
+          <w:cs/>
           <w:lang w:val="ar_AE" w:bidi="ar_AE"/>
         </w:rPr>
         <w:t>Resource: Biblica Study Notes</w:t>
       </w:r>
       <w:r>
         <w:rPr>
+          <w:rtl/>
+          <w:cs/>
           <w:lang w:val="ar_AE" w:bidi="ar_AE"/>
         </w:rPr>
       </w:r>
@@ -36,53 +42,71 @@
       </w:pPr>
       <w:r>
         <w:rPr>
+          <w:rtl/>
+          <w:cs/>
           <w:lang w:val="ar_AE" w:bidi="ar_AE"/>
         </w:rPr>
       </w:r>
       <w:r>
         <w:rPr>
           <w:b/>
+          <w:rtl/>
+          <w:cs/>
           <w:lang w:val="ar_AE" w:bidi="ar_AE"/>
         </w:rPr>
         <w:t>Biblica Study Notes (Book Intros)</w:t>
       </w:r>
       <w:r>
         <w:rPr>
+          <w:rtl/>
+          <w:cs/>
           <w:lang w:val="ar_AE" w:bidi="ar_AE"/>
         </w:rPr>
         <w:t xml:space="preserve"> © 2023 Biblica Inc. Released under CC BY-SA 4.0 license. </w:t>
       </w:r>
       <w:r>
         <w:rPr>
+          <w:rtl/>
+          <w:cs/>
           <w:lang w:val="ar_AE" w:bidi="ar_AE"/>
         </w:rPr>
         <w:t>Biblica Study Notes</w:t>
       </w:r>
       <w:r>
         <w:rPr>
+          <w:rtl/>
+          <w:cs/>
           <w:lang w:val="ar_AE" w:bidi="ar_AE"/>
         </w:rPr>
         <w:t xml:space="preserve"> has been adapted in the following languages: Tok Pisin, Arabic (عربي), French (Français), Hindi (हिंदी), Indonesian (Bahasa Indonesia), Portuguese (Português), Russian (Русский), Spanish (Español), Swahili (Kiswahili), and Simplified Chinese (简体中文)from </w:t>
       </w:r>
       <w:r>
         <w:rPr>
+          <w:rtl/>
+          <w:cs/>
           <w:lang w:val="ar_AE" w:bidi="ar_AE"/>
         </w:rPr>
         <w:t>Biblica Study Notes</w:t>
       </w:r>
       <w:r>
         <w:rPr>
+          <w:rtl/>
+          <w:cs/>
           <w:lang w:val="ar_AE" w:bidi="ar_AE"/>
         </w:rPr>
         <w:t xml:space="preserve"> © 2023 Biblica Inc. Released under CC BY-SA 4.0 license by Mission Mutual</w:t>
       </w:r>
       <w:r>
         <w:rPr>
-          <w:lang w:val="ar_AE" w:bidi="ar_AE"/>
-        </w:rPr>
-      </w:r>
-      <w:r>
-        <w:rPr>
+          <w:rtl/>
+          <w:cs/>
+          <w:lang w:val="ar_AE" w:bidi="ar_AE"/>
+        </w:rPr>
+      </w:r>
+      <w:r>
+        <w:rPr>
+          <w:rtl/>
+          <w:cs/>
           <w:lang w:val="ar_AE" w:bidi="ar_AE"/>
         </w:rPr>
       </w:r>
@@ -94,6 +118,8 @@
       </w:pPr>
       <w:r>
         <w:rPr>
+          <w:rtl/>
+          <w:cs/>
           <w:lang w:val="ar_AE" w:bidi="ar_AE"/>
         </w:rPr>
         <w:t>Biblica Study Notes</w:t>
@@ -123,6 +149,8 @@
       </w:pPr>
       <w:r>
         <w:rPr>
+          <w:rtl/>
+          <w:cs/>
           <w:lang w:val="ar_AE" w:bidi="ar_AE"/>
         </w:rPr>
       </w:r>
@@ -134,12 +162,16 @@
       </w:pPr>
       <w:r>
         <w:rPr>
+          <w:rtl/>
+          <w:cs/>
           <w:lang w:val="ar_AE" w:bidi="ar_AE"/>
         </w:rPr>
         <w:t>GEN</w:t>
       </w:r>
       <w:r>
         <w:rPr>
+          <w:rtl/>
+          <w:cs/>
           <w:lang w:val="ar_AE" w:bidi="ar_AE"/>
         </w:rPr>
       </w:r>
@@ -150,22 +182,30 @@
       </w:pPr>
       <w:r>
         <w:rPr>
-          <w:lang w:val="ar_AE" w:bidi="ar_AE"/>
-        </w:rPr>
-      </w:r>
-      <w:r>
-        <w:rPr>
+          <w:rtl/>
+          <w:cs/>
+          <w:lang w:val="ar_AE" w:bidi="ar_AE"/>
+        </w:rPr>
+      </w:r>
+      <w:r>
+        <w:rPr>
+          <w:rtl/>
+          <w:cs/>
           <w:lang w:val="ar_AE" w:bidi="ar_AE"/>
         </w:rPr>
         <w:t xml:space="preserve"> </w:t>
       </w:r>
       <w:r>
         <w:rPr>
-          <w:lang w:val="ar_AE" w:bidi="ar_AE"/>
-        </w:rPr>
-      </w:r>
-      <w:r>
-        <w:rPr>
+          <w:rtl/>
+          <w:cs/>
+          <w:lang w:val="ar_AE" w:bidi="ar_AE"/>
+        </w:rPr>
+      </w:r>
+      <w:r>
+        <w:rPr>
+          <w:rtl/>
+          <w:cs/>
           <w:lang w:val="ar_AE" w:bidi="ar_AE"/>
         </w:rPr>
       </w:r>
@@ -191,6 +231,8 @@
       </w:pPr>
       <w:r>
         <w:rPr>
+          <w:rtl/>
+          <w:cs/>
           <w:lang w:val="ar_AE" w:bidi="ar_AE"/>
         </w:rPr>
       </w:r>
@@ -202,12 +244,16 @@
       </w:pPr>
       <w:r>
         <w:rPr>
+          <w:rtl/>
+          <w:cs/>
           <w:lang w:val="ar_AE" w:bidi="ar_AE"/>
         </w:rPr>
         <w:t>التكوين</w:t>
       </w:r>
       <w:r>
         <w:rPr>
+          <w:rtl/>
+          <w:cs/>
           <w:lang w:val="ar_AE" w:bidi="ar_AE"/>
         </w:rPr>
       </w:r>
@@ -218,12 +264,16 @@
       </w:pPr>
       <w:r>
         <w:rPr>
+          <w:rtl/>
+          <w:cs/>
           <w:lang w:val="ar_AE" w:bidi="ar_AE"/>
         </w:rPr>
       </w:r>
       <w:r>
         <w:rPr>
           <w:b/>
+          <w:rtl/>
+          <w:cs/>
           <w:lang w:val="ar_AE" w:bidi="ar_AE"/>
         </w:rPr>
         <w:t>ما هو سفر التكوين؟</w:t>
@@ -238,11 +288,15 @@
       </w:pPr>
       <w:r>
         <w:rPr>
-          <w:lang w:val="ar_AE" w:bidi="ar_AE"/>
-        </w:rPr>
-      </w:r>
-      <w:r>
-        <w:rPr>
+          <w:rtl/>
+          <w:cs/>
+          <w:lang w:val="ar_AE" w:bidi="ar_AE"/>
+        </w:rPr>
+      </w:r>
+      <w:r>
+        <w:rPr>
+          <w:rtl/>
+          <w:cs/>
           <w:lang w:val="ar_AE" w:bidi="ar_AE"/>
         </w:rPr>
         <w:t>سفر التكوين هو سرد لبداية العالم وأمة إسرائيل. ويُسجَّل سفر التكوين في صورة مجموعة من القصص. تم تناقل هذه القصص عبر العائلات الإسرائيلية واليهودية لمئات السنين.</w:t>
@@ -257,11 +311,15 @@
       </w:pPr>
       <w:r>
         <w:rPr>
-          <w:lang w:val="ar_AE" w:bidi="ar_AE"/>
-        </w:rPr>
-      </w:r>
-      <w:r>
-        <w:rPr>
+          <w:rtl/>
+          <w:cs/>
+          <w:lang w:val="ar_AE" w:bidi="ar_AE"/>
+        </w:rPr>
+      </w:r>
+      <w:r>
+        <w:rPr>
+          <w:rtl/>
+          <w:cs/>
           <w:lang w:val="ar_AE" w:bidi="ar_AE"/>
         </w:rPr>
         <w:t>يُعتقد أن موسى كتب بعض من هذه القصص. كما يُعتقد أنه كتبها بين سنة 1450 وسنة 1410 قبل الميلاد.</w:t>
@@ -276,11 +334,15 @@
       </w:pPr>
       <w:r>
         <w:rPr>
-          <w:lang w:val="ar_AE" w:bidi="ar_AE"/>
-        </w:rPr>
-      </w:r>
-      <w:r>
-        <w:rPr>
+          <w:rtl/>
+          <w:cs/>
+          <w:lang w:val="ar_AE" w:bidi="ar_AE"/>
+        </w:rPr>
+      </w:r>
+      <w:r>
+        <w:rPr>
+          <w:rtl/>
+          <w:cs/>
           <w:lang w:val="ar_AE" w:bidi="ar_AE"/>
         </w:rPr>
         <w:t>تمت كتابة أجزاء أخرى من سفر التكوين بواسطة أشخاص آخرين من شعب إسرائيل.</w:t>
@@ -292,12 +354,16 @@
       </w:pPr>
       <w:r>
         <w:rPr>
+          <w:rtl/>
+          <w:cs/>
           <w:lang w:val="ar_AE" w:bidi="ar_AE"/>
         </w:rPr>
       </w:r>
       <w:r>
         <w:rPr>
           <w:b/>
+          <w:rtl/>
+          <w:cs/>
           <w:lang w:val="ar_AE" w:bidi="ar_AE"/>
         </w:rPr>
         <w:t>لمن كُتب هذا السفر؟</w:t>
@@ -312,11 +378,15 @@
       </w:pPr>
       <w:r>
         <w:rPr>
-          <w:lang w:val="ar_AE" w:bidi="ar_AE"/>
-        </w:rPr>
-      </w:r>
-      <w:r>
-        <w:rPr>
+          <w:rtl/>
+          <w:cs/>
+          <w:lang w:val="ar_AE" w:bidi="ar_AE"/>
+        </w:rPr>
+      </w:r>
+      <w:r>
+        <w:rPr>
+          <w:rtl/>
+          <w:cs/>
           <w:lang w:val="ar_AE" w:bidi="ar_AE"/>
         </w:rPr>
         <w:t>لشعب إسرائيل.</w:t>
@@ -328,12 +398,16 @@
       </w:pPr>
       <w:r>
         <w:rPr>
+          <w:rtl/>
+          <w:cs/>
           <w:lang w:val="ar_AE" w:bidi="ar_AE"/>
         </w:rPr>
       </w:r>
       <w:r>
         <w:rPr>
           <w:b/>
+          <w:rtl/>
+          <w:cs/>
           <w:lang w:val="ar_AE" w:bidi="ar_AE"/>
         </w:rPr>
         <w:t>لماذا كُتب سفر التكوين؟</w:t>
@@ -348,11 +422,15 @@
       </w:pPr>
       <w:r>
         <w:rPr>
-          <w:lang w:val="ar_AE" w:bidi="ar_AE"/>
-        </w:rPr>
-      </w:r>
-      <w:r>
-        <w:rPr>
+          <w:rtl/>
+          <w:cs/>
+          <w:lang w:val="ar_AE" w:bidi="ar_AE"/>
+        </w:rPr>
+      </w:r>
+      <w:r>
+        <w:rPr>
+          <w:rtl/>
+          <w:cs/>
           <w:lang w:val="ar_AE" w:bidi="ar_AE"/>
         </w:rPr>
         <w:t>ليصف بداية الخليقة والبشر والخطية والخلاص وشعب إسرائيل. في اللغة اليونانية، كلمة تكوين تعني البداية.</w:t>
@@ -367,11 +445,15 @@
       </w:pPr>
       <w:r>
         <w:rPr>
-          <w:lang w:val="ar_AE" w:bidi="ar_AE"/>
-        </w:rPr>
-      </w:r>
-      <w:r>
-        <w:rPr>
+          <w:rtl/>
+          <w:cs/>
+          <w:lang w:val="ar_AE" w:bidi="ar_AE"/>
+        </w:rPr>
+      </w:r>
+      <w:r>
+        <w:rPr>
+          <w:rtl/>
+          <w:cs/>
           <w:lang w:val="ar_AE" w:bidi="ar_AE"/>
         </w:rPr>
         <w:t>لإظهار أن الله هو خالق كل الحياة.</w:t>
@@ -383,12 +465,16 @@
       </w:pPr>
       <w:r>
         <w:rPr>
+          <w:rtl/>
+          <w:cs/>
           <w:lang w:val="ar_AE" w:bidi="ar_AE"/>
         </w:rPr>
       </w:r>
       <w:r>
         <w:rPr>
           <w:b/>
+          <w:rtl/>
+          <w:cs/>
           <w:lang w:val="ar_AE" w:bidi="ar_AE"/>
         </w:rPr>
         <w:t>الأفكار الرئيسية</w:t>
@@ -403,11 +489,15 @@
       </w:pPr>
       <w:r>
         <w:rPr>
-          <w:lang w:val="ar_AE" w:bidi="ar_AE"/>
-        </w:rPr>
-      </w:r>
-      <w:r>
-        <w:rPr>
+          <w:rtl/>
+          <w:cs/>
+          <w:lang w:val="ar_AE" w:bidi="ar_AE"/>
+        </w:rPr>
+      </w:r>
+      <w:r>
+        <w:rPr>
+          <w:rtl/>
+          <w:cs/>
           <w:lang w:val="ar_AE" w:bidi="ar_AE"/>
         </w:rPr>
         <w:t>الله صالح. وقد خلق عالمًا حسنًا.</w:t>
@@ -422,11 +512,15 @@
       </w:pPr>
       <w:r>
         <w:rPr>
-          <w:lang w:val="ar_AE" w:bidi="ar_AE"/>
-        </w:rPr>
-      </w:r>
-      <w:r>
-        <w:rPr>
+          <w:rtl/>
+          <w:cs/>
+          <w:lang w:val="ar_AE" w:bidi="ar_AE"/>
+        </w:rPr>
+      </w:r>
+      <w:r>
+        <w:rPr>
+          <w:rtl/>
+          <w:cs/>
           <w:lang w:val="ar_AE" w:bidi="ar_AE"/>
         </w:rPr>
         <w:t>الخطية شر. ونتيجة الخطية موت.</w:t>
@@ -441,11 +535,15 @@
       </w:pPr>
       <w:r>
         <w:rPr>
-          <w:lang w:val="ar_AE" w:bidi="ar_AE"/>
-        </w:rPr>
-      </w:r>
-      <w:r>
-        <w:rPr>
+          <w:rtl/>
+          <w:cs/>
+          <w:lang w:val="ar_AE" w:bidi="ar_AE"/>
+        </w:rPr>
+      </w:r>
+      <w:r>
+        <w:rPr>
+          <w:rtl/>
+          <w:cs/>
           <w:lang w:val="ar_AE" w:bidi="ar_AE"/>
         </w:rPr>
         <w:t>الله ملتزم بأن يبارك العالم الذي خلقه وبأن يخلصه من الخطية والموت والشر. وقد أقام عهودًا مع إبراهيم وإسحاق ويعقوب وعائلاتهم. كانت هذه العهود جزءًا من خطة الله للبركة والخلاص.</w:t>
@@ -457,12 +555,16 @@
       </w:pPr>
       <w:r>
         <w:rPr>
+          <w:rtl/>
+          <w:cs/>
           <w:lang w:val="ar_AE" w:bidi="ar_AE"/>
         </w:rPr>
       </w:r>
       <w:r>
         <w:rPr>
           <w:b/>
+          <w:rtl/>
+          <w:cs/>
           <w:lang w:val="ar_AE" w:bidi="ar_AE"/>
         </w:rPr>
         <w:t>مخطط السفر</w:t>
@@ -474,12 +576,16 @@
       </w:pPr>
       <w:r>
         <w:rPr>
+          <w:rtl/>
+          <w:cs/>
           <w:lang w:val="ar_AE" w:bidi="ar_AE"/>
         </w:rPr>
       </w:r>
       <w:r>
         <w:rPr>
           <w:b/>
+          <w:rtl/>
+          <w:cs/>
           <w:lang w:val="ar_AE" w:bidi="ar_AE"/>
         </w:rPr>
         <w:t>بداية الخليقة والبشر والخطية (1 - 3).</w:t>
@@ -491,12 +597,16 @@
       </w:pPr>
       <w:r>
         <w:rPr>
+          <w:rtl/>
+          <w:cs/>
           <w:lang w:val="ar_AE" w:bidi="ar_AE"/>
         </w:rPr>
       </w:r>
       <w:r>
         <w:rPr>
           <w:b/>
+          <w:rtl/>
+          <w:cs/>
           <w:lang w:val="ar_AE" w:bidi="ar_AE"/>
         </w:rPr>
         <w:t>قصة عائلة آدم وحواء (4 - 5).</w:t>
@@ -508,12 +618,16 @@
       </w:pPr>
       <w:r>
         <w:rPr>
+          <w:rtl/>
+          <w:cs/>
           <w:lang w:val="ar_AE" w:bidi="ar_AE"/>
         </w:rPr>
       </w:r>
       <w:r>
         <w:rPr>
           <w:b/>
+          <w:rtl/>
+          <w:cs/>
           <w:lang w:val="ar_AE" w:bidi="ar_AE"/>
         </w:rPr>
         <w:t>قصة نوح وعائلته (6 - 11).</w:t>
@@ -525,12 +639,16 @@
       </w:pPr>
       <w:r>
         <w:rPr>
+          <w:rtl/>
+          <w:cs/>
           <w:lang w:val="ar_AE" w:bidi="ar_AE"/>
         </w:rPr>
       </w:r>
       <w:r>
         <w:rPr>
           <w:b/>
+          <w:rtl/>
+          <w:cs/>
           <w:lang w:val="ar_AE" w:bidi="ar_AE"/>
         </w:rPr>
         <w:t>قصة إبراهيم وعائلته (12 – 25:18).</w:t>
@@ -542,12 +660,16 @@
       </w:pPr>
       <w:r>
         <w:rPr>
+          <w:rtl/>
+          <w:cs/>
           <w:lang w:val="ar_AE" w:bidi="ar_AE"/>
         </w:rPr>
       </w:r>
       <w:r>
         <w:rPr>
           <w:b/>
+          <w:rtl/>
+          <w:cs/>
           <w:lang w:val="ar_AE" w:bidi="ar_AE"/>
         </w:rPr>
         <w:t>قصة إسحاق وعائلته (25:19 – 28:9).</w:t>
@@ -559,12 +681,16 @@
       </w:pPr>
       <w:r>
         <w:rPr>
+          <w:rtl/>
+          <w:cs/>
           <w:lang w:val="ar_AE" w:bidi="ar_AE"/>
         </w:rPr>
       </w:r>
       <w:r>
         <w:rPr>
           <w:b/>
+          <w:rtl/>
+          <w:cs/>
           <w:lang w:val="ar_AE" w:bidi="ar_AE"/>
         </w:rPr>
         <w:t>قصة يعقوب وعائلته (28:10 – 36:43).</w:t>
@@ -576,23 +702,31 @@
       </w:pPr>
       <w:r>
         <w:rPr>
+          <w:rtl/>
+          <w:cs/>
           <w:lang w:val="ar_AE" w:bidi="ar_AE"/>
         </w:rPr>
       </w:r>
       <w:r>
         <w:rPr>
           <w:b/>
+          <w:rtl/>
+          <w:cs/>
           <w:lang w:val="ar_AE" w:bidi="ar_AE"/>
         </w:rPr>
         <w:t>قصة يوسف وعائلته (37 - 50).</w:t>
       </w:r>
       <w:r>
         <w:rPr>
-          <w:lang w:val="ar_AE" w:bidi="ar_AE"/>
-        </w:rPr>
-      </w:r>
-      <w:r>
-        <w:rPr>
+          <w:rtl/>
+          <w:cs/>
+          <w:lang w:val="ar_AE" w:bidi="ar_AE"/>
+        </w:rPr>
+      </w:r>
+      <w:r>
+        <w:rPr>
+          <w:rtl/>
+          <w:cs/>
           <w:lang w:val="ar_AE" w:bidi="ar_AE"/>
         </w:rPr>
       </w:r>

</xml_diff>